<commit_message>
fix(stage5b): real Microsoft extension namespaces, WPS reference and SSIM gate (STAGE-5B-REWORK-1)
</commit_message>
<xml_diff>
--- a/strict-ooxml-core/tests/strict/strict-stage5b.docx
+++ b/strict-ooxml-core/tests/strict/strict-stage5b.docx
@@ -1,6 +1,6 @@
 
 <file path=word/document.xml><?xml version="1.0" encoding="utf-8"?>
-<w:document xmlns:w="http://purl.oclc.org/ooxml/wordprocessingml/main" xmlns:r="http://purl.oclc.org/ooxml/officeDocument/relationships" xmlns:wp="http://purl.oclc.org/ooxml/drawingml/wordprocessingDrawing" xmlns:a="http://purl.oclc.org/ooxml/drawingml/main" xmlns:pic="http://purl.oclc.org/ooxml/drawingml/picture" xmlns:wps="http://purl.oclc.org/ooxml/drawingml/wordprocessingShape" xmlns:wpg="http://purl.oclc.org/ooxml/drawingml/wordprocessingGroup">
+<w:document xmlns:w="http://purl.oclc.org/ooxml/wordprocessingml/main" xmlns:r="http://purl.oclc.org/ooxml/officeDocument/relationships" xmlns:wp="http://purl.oclc.org/ooxml/drawingml/wordprocessingDrawing" xmlns:a="http://purl.oclc.org/ooxml/drawingml/main" xmlns:pic="http://purl.oclc.org/ooxml/drawingml/picture" xmlns:wps="http://schemas.microsoft.com/office/word/2010/wordprocessingShape" xmlns:wpg="http://schemas.microsoft.com/office/word/2010/wordprocessingGroup">
   <w:body>
     <w:p>
       <w:r>
@@ -23,7 +23,7 @@
             <wp:wrapNone/>
             <wp:docPr id="1" name="Shape"/>
             <a:graphic>
-              <a:graphicData uri="http://purl.oclc.org/ooxml/drawingml/wordprocessingShape">
+              <a:graphicData uri="http://schemas.microsoft.com/office/word/2010/wordprocessingShape">
                 <wps:wsp>
                   <wps:cNvPr id="1" name="Shape"/>
                   <wps:cNvSpPr/>
@@ -65,7 +65,7 @@
             <wp:wrapNone/>
             <wp:docPr id="2" name="Group"/>
             <a:graphic>
-              <a:graphicData uri="http://purl.oclc.org/ooxml/drawingml/wordprocessingGroup">
+              <a:graphicData uri="http://schemas.microsoft.com/office/word/2010/wordprocessingGroup">
                 <wpg:wgp>
                   <wpg:cNvPr id="2" name="Group"/>
                   <wpg:cNvSpPr/>
@@ -138,7 +138,7 @@
             <wp:wrapNone/>
             <wp:docPr id="3" name="TextBox"/>
             <a:graphic>
-              <a:graphicData uri="http://purl.oclc.org/ooxml/drawingml/wordprocessingShape">
+              <a:graphicData uri="http://schemas.microsoft.com/office/word/2010/wordprocessingShape">
                 <wps:wsp>
                   <wps:cNvPr id="4" name="Box"/>
                   <wps:cNvSpPr txBox="1"/>

</xml_diff>